<commit_message>
work on interim paper
</commit_message>
<xml_diff>
--- a/termpaper/DiPietrantonio_ME5311_TermPaper.docx
+++ b/termpaper/DiPietrantonio_ME5311_TermPaper.docx
@@ -183,9 +183,11 @@
     <w:sdt>
       <w:sdtPr>
         <w:rPr>
-          <w:rFonts w:ascii="Times New Roman" w:hAnsi="Times New Roman" w:cs="Times New Roman"/>
-          <w:b/>
-          <w:bCs/>
+          <w:rFonts w:ascii="Times New Roman" w:eastAsiaTheme="minorHAnsi" w:hAnsi="Times New Roman" w:cs="Times New Roman"/>
+          <w:b/>
+          <w:bCs/>
+          <w:spacing w:val="0"/>
+          <w:kern w:val="2"/>
           <w:sz w:val="24"/>
           <w:szCs w:val="24"/>
         </w:rPr>
@@ -197,10 +199,8 @@
       </w:sdtPr>
       <w:sdtEndPr>
         <w:rPr>
-          <w:rFonts w:asciiTheme="minorHAnsi" w:eastAsiaTheme="minorHAnsi" w:hAnsiTheme="minorHAnsi" w:cstheme="minorBidi"/>
+          <w:rFonts w:asciiTheme="minorHAnsi" w:hAnsiTheme="minorHAnsi" w:cstheme="minorBidi"/>
           <w:noProof/>
-          <w:spacing w:val="0"/>
-          <w:kern w:val="2"/>
         </w:rPr>
       </w:sdtEndPr>
       <w:sdtContent>
@@ -996,8 +996,6 @@
         </w:numPr>
         <w:rPr>
           <w:rFonts w:ascii="Times New Roman" w:hAnsi="Times New Roman" w:cs="Times New Roman"/>
-          <w:b/>
-          <w:bCs/>
           <w:sz w:val="22"/>
           <w:szCs w:val="22"/>
         </w:rPr>
@@ -1021,6 +1019,58 @@
           <w:szCs w:val="22"/>
         </w:rPr>
         <w:t>:</w:t>
+      </w:r>
+    </w:p>
+    <w:p>
+      <w:pPr>
+        <w:pStyle w:val="NoSpacing"/>
+        <w:numPr>
+          <w:ilvl w:val="1"/>
+          <w:numId w:val="2"/>
+        </w:numPr>
+        <w:rPr>
+          <w:rFonts w:ascii="Times New Roman" w:hAnsi="Times New Roman" w:cs="Times New Roman"/>
+          <w:sz w:val="22"/>
+          <w:szCs w:val="22"/>
+        </w:rPr>
+      </w:pPr>
+      <w:r>
+        <w:rPr>
+          <w:rFonts w:ascii="Times New Roman" w:hAnsi="Times New Roman" w:cs="Times New Roman"/>
+          <w:sz w:val="22"/>
+          <w:szCs w:val="22"/>
+        </w:rPr>
+        <w:t>Introduce options</w:t>
+      </w:r>
+      <w:r>
+        <w:rPr>
+          <w:rFonts w:ascii="Times New Roman" w:hAnsi="Times New Roman" w:cs="Times New Roman"/>
+          <w:sz w:val="22"/>
+          <w:szCs w:val="22"/>
+        </w:rPr>
+        <w:t xml:space="preserve"> (difference between American and European and importance of this difference)</w:t>
+      </w:r>
+    </w:p>
+    <w:p>
+      <w:pPr>
+        <w:pStyle w:val="NoSpacing"/>
+        <w:numPr>
+          <w:ilvl w:val="1"/>
+          <w:numId w:val="2"/>
+        </w:numPr>
+        <w:rPr>
+          <w:rFonts w:ascii="Times New Roman" w:hAnsi="Times New Roman" w:cs="Times New Roman"/>
+          <w:sz w:val="22"/>
+          <w:szCs w:val="22"/>
+        </w:rPr>
+      </w:pPr>
+      <w:r>
+        <w:rPr>
+          <w:rFonts w:ascii="Times New Roman" w:hAnsi="Times New Roman" w:cs="Times New Roman"/>
+          <w:sz w:val="22"/>
+          <w:szCs w:val="22"/>
+        </w:rPr>
+        <w:t>Introduce concept of frictionless and efficient markets and their significance</w:t>
       </w:r>
     </w:p>
     <w:p>
@@ -1373,91 +1423,97 @@
           <w:sz w:val="22"/>
           <w:szCs w:val="22"/>
         </w:rPr>
-        <w:t xml:space="preserve">Derivation of the BSM PDE from the </w:t>
-      </w:r>
-      <w:proofErr w:type="spellStart"/>
-      <w:r>
+        <w:t>Derivation of the BSM PDE from the ito calculus (Shreve; Baxter &amp; Rennie)</w:t>
+      </w:r>
+    </w:p>
+    <w:p>
+      <w:pPr>
+        <w:pStyle w:val="NoSpacing"/>
+        <w:numPr>
+          <w:ilvl w:val="0"/>
+          <w:numId w:val="2"/>
+        </w:numPr>
         <w:rPr>
           <w:rFonts w:ascii="Times New Roman" w:eastAsiaTheme="minorEastAsia" w:hAnsi="Times New Roman" w:cs="Times New Roman"/>
-          <w:sz w:val="22"/>
-          <w:szCs w:val="22"/>
-        </w:rPr>
-        <w:t>ito</w:t>
-      </w:r>
-      <w:proofErr w:type="spellEnd"/>
+          <w:b/>
+          <w:bCs/>
+          <w:sz w:val="22"/>
+          <w:szCs w:val="22"/>
+        </w:rPr>
+      </w:pPr>
       <w:r>
         <w:rPr>
           <w:rFonts w:ascii="Times New Roman" w:eastAsiaTheme="minorEastAsia" w:hAnsi="Times New Roman" w:cs="Times New Roman"/>
-          <w:sz w:val="22"/>
-          <w:szCs w:val="22"/>
-        </w:rPr>
-        <w:t xml:space="preserve"> calculus (Shreve; Baxter &amp; Rennie)</w:t>
+          <w:b/>
+          <w:bCs/>
+          <w:sz w:val="22"/>
+          <w:szCs w:val="22"/>
+        </w:rPr>
+        <w:t>Notes:</w:t>
       </w:r>
     </w:p>
     <w:p>
       <w:pPr>
         <w:pStyle w:val="NoSpacing"/>
         <w:numPr>
-          <w:ilvl w:val="0"/>
-          <w:numId w:val="2"/>
-        </w:numPr>
-        <w:rPr>
-          <w:rFonts w:ascii="Times New Roman" w:eastAsiaTheme="minorEastAsia" w:hAnsi="Times New Roman" w:cs="Times New Roman"/>
-          <w:b/>
-          <w:bCs/>
-          <w:sz w:val="22"/>
-          <w:szCs w:val="22"/>
-        </w:rPr>
-      </w:pPr>
-      <w:r>
-        <w:rPr>
-          <w:rFonts w:ascii="Times New Roman" w:eastAsiaTheme="minorEastAsia" w:hAnsi="Times New Roman" w:cs="Times New Roman"/>
-          <w:b/>
-          <w:bCs/>
-          <w:sz w:val="22"/>
-          <w:szCs w:val="22"/>
-        </w:rPr>
-        <w:t>Notes:</w:t>
+          <w:ilvl w:val="1"/>
+          <w:numId w:val="2"/>
+        </w:numPr>
+        <w:rPr>
+          <w:rFonts w:ascii="Times New Roman" w:hAnsi="Times New Roman" w:cs="Times New Roman"/>
+          <w:b/>
+          <w:bCs/>
+          <w:sz w:val="22"/>
+          <w:szCs w:val="22"/>
+        </w:rPr>
+      </w:pPr>
+      <w:r>
+        <w:rPr>
+          <w:rFonts w:ascii="Times New Roman" w:hAnsi="Times New Roman" w:cs="Times New Roman"/>
+          <w:sz w:val="22"/>
+          <w:szCs w:val="22"/>
+        </w:rPr>
+        <w:t xml:space="preserve">BSM comes from stochastic calculus, not fluids </w:t>
+      </w:r>
+      <w:r>
+        <w:rPr>
+          <w:rFonts w:ascii="Times New Roman" w:hAnsi="Times New Roman" w:cs="Times New Roman"/>
+          <w:sz w:val="22"/>
+          <w:szCs w:val="22"/>
+        </w:rPr>
+        <w:sym w:font="Wingdings" w:char="F0E0"/>
+      </w:r>
+      <w:r>
+        <w:rPr>
+          <w:rFonts w:ascii="Times New Roman" w:hAnsi="Times New Roman" w:cs="Times New Roman"/>
+          <w:sz w:val="22"/>
+          <w:szCs w:val="22"/>
+        </w:rPr>
+        <w:t xml:space="preserve"> provide minimum mathematical background</w:t>
       </w:r>
     </w:p>
     <w:p>
       <w:pPr>
         <w:pStyle w:val="NoSpacing"/>
         <w:numPr>
-          <w:ilvl w:val="1"/>
-          <w:numId w:val="2"/>
-        </w:numPr>
-        <w:rPr>
-          <w:rFonts w:ascii="Times New Roman" w:hAnsi="Times New Roman" w:cs="Times New Roman"/>
-          <w:b/>
-          <w:bCs/>
-          <w:sz w:val="22"/>
-          <w:szCs w:val="22"/>
-        </w:rPr>
-      </w:pPr>
-      <w:r>
-        <w:rPr>
-          <w:rFonts w:ascii="Times New Roman" w:hAnsi="Times New Roman" w:cs="Times New Roman"/>
-          <w:sz w:val="22"/>
-          <w:szCs w:val="22"/>
-        </w:rPr>
-        <w:t xml:space="preserve">BSM comes from stochastic calculus, not fluids </w:t>
-      </w:r>
-      <w:r>
-        <w:rPr>
-          <w:rFonts w:ascii="Times New Roman" w:hAnsi="Times New Roman" w:cs="Times New Roman"/>
-          <w:sz w:val="22"/>
-          <w:szCs w:val="22"/>
-        </w:rPr>
-        <w:sym w:font="Wingdings" w:char="F0E0"/>
-      </w:r>
-      <w:r>
-        <w:rPr>
-          <w:rFonts w:ascii="Times New Roman" w:hAnsi="Times New Roman" w:cs="Times New Roman"/>
-          <w:sz w:val="22"/>
-          <w:szCs w:val="22"/>
-        </w:rPr>
-        <w:t xml:space="preserve"> provide minimum mathematical background</w:t>
+          <w:ilvl w:val="2"/>
+          <w:numId w:val="2"/>
+        </w:numPr>
+        <w:rPr>
+          <w:rFonts w:ascii="Times New Roman" w:hAnsi="Times New Roman" w:cs="Times New Roman"/>
+          <w:b/>
+          <w:bCs/>
+          <w:sz w:val="22"/>
+          <w:szCs w:val="22"/>
+        </w:rPr>
+      </w:pPr>
+      <w:r>
+        <w:rPr>
+          <w:rFonts w:ascii="Times New Roman" w:hAnsi="Times New Roman" w:cs="Times New Roman"/>
+          <w:sz w:val="22"/>
+          <w:szCs w:val="22"/>
+        </w:rPr>
+        <w:t>What random motion the asset follows</w:t>
       </w:r>
     </w:p>
     <w:p>
@@ -1481,49 +1537,7 @@
           <w:sz w:val="22"/>
           <w:szCs w:val="22"/>
         </w:rPr>
-        <w:t>What random motion the asset follows</w:t>
-      </w:r>
-    </w:p>
-    <w:p>
-      <w:pPr>
-        <w:pStyle w:val="NoSpacing"/>
-        <w:numPr>
-          <w:ilvl w:val="2"/>
-          <w:numId w:val="2"/>
-        </w:numPr>
-        <w:rPr>
-          <w:rFonts w:ascii="Times New Roman" w:hAnsi="Times New Roman" w:cs="Times New Roman"/>
-          <w:b/>
-          <w:bCs/>
-          <w:sz w:val="22"/>
-          <w:szCs w:val="22"/>
-        </w:rPr>
-      </w:pPr>
-      <w:r>
-        <w:rPr>
-          <w:rFonts w:ascii="Times New Roman" w:hAnsi="Times New Roman" w:cs="Times New Roman"/>
-          <w:sz w:val="22"/>
-          <w:szCs w:val="22"/>
-        </w:rPr>
-        <w:t xml:space="preserve">How </w:t>
-      </w:r>
-      <w:proofErr w:type="spellStart"/>
-      <w:r>
-        <w:rPr>
-          <w:rFonts w:ascii="Times New Roman" w:hAnsi="Times New Roman" w:cs="Times New Roman"/>
-          <w:sz w:val="22"/>
-          <w:szCs w:val="22"/>
-        </w:rPr>
-        <w:t>ito</w:t>
-      </w:r>
-      <w:proofErr w:type="spellEnd"/>
-      <w:r>
-        <w:rPr>
-          <w:rFonts w:ascii="Times New Roman" w:hAnsi="Times New Roman" w:cs="Times New Roman"/>
-          <w:sz w:val="22"/>
-          <w:szCs w:val="22"/>
-        </w:rPr>
-        <w:t xml:space="preserve"> calculus leads to a PDE</w:t>
+        <w:t>How ito calculus leads to a PDE</w:t>
       </w:r>
     </w:p>
     <w:p>
@@ -2181,6 +2195,7 @@
           <w:sz w:val="22"/>
           <w:szCs w:val="22"/>
         </w:rPr>
+        <w:lastRenderedPageBreak/>
         <w:t>Core Financial PDE (“physics” of the finance side. Like defining the NS equations before discussing turbulence models</w:t>
       </w:r>
     </w:p>
@@ -2247,7 +2262,6 @@
           <w:sz w:val="22"/>
           <w:szCs w:val="22"/>
         </w:rPr>
-        <w:lastRenderedPageBreak/>
         <w:t xml:space="preserve">Explain the assumptions </w:t>
       </w:r>
     </w:p>
@@ -3078,16 +3092,7 @@
           <w:rPr>
             <w:rFonts w:ascii="Cambria Math" w:hAnsi="Cambria Math" w:cs="Times New Roman"/>
           </w:rPr>
-          <m:t>∇</m:t>
-        </m:r>
-        <m:r>
-          <m:rPr>
-            <m:sty m:val="p"/>
-          </m:rPr>
-          <w:rPr>
-            <w:rFonts w:ascii="Cambria Math" w:hAnsi="Cambria Math" w:cs="Times New Roman"/>
-          </w:rPr>
-          <m:t> </m:t>
+          <m:t>∇ </m:t>
         </m:r>
         <m:r>
           <w:rPr>
@@ -3327,6 +3332,7 @@
       </w:pPr>
       <w:bookmarkStart w:id="5" w:name="_Toc222762154"/>
       <w:r>
+        <w:lastRenderedPageBreak/>
         <w:t>MAPPING BETWEEN BSM AND CFD PDF TRANSPORT</w:t>
       </w:r>
       <w:bookmarkEnd w:id="5"/>
@@ -3422,7 +3428,6 @@
         <w:rPr>
           <w:rFonts w:ascii="Times New Roman" w:hAnsi="Times New Roman" w:cs="Times New Roman"/>
         </w:rPr>
-        <w:lastRenderedPageBreak/>
         <w:t>Variable mapping:</w:t>
       </w:r>
     </w:p>
@@ -3495,16 +3500,8 @@
         <w:rPr>
           <w:rFonts w:ascii="Times New Roman" w:hAnsi="Times New Roman" w:cs="Times New Roman"/>
         </w:rPr>
-        <w:t xml:space="preserve"> drift </w:t>
-      </w:r>
-      <w:proofErr w:type="spellStart"/>
-      <w:r>
-        <w:rPr>
-          <w:rFonts w:ascii="Times New Roman" w:hAnsi="Times New Roman" w:cs="Times New Roman"/>
-        </w:rPr>
-        <w:t>rS</w:t>
-      </w:r>
-      <w:proofErr w:type="spellEnd"/>
+        <w:t xml:space="preserve"> drift rS</w:t>
+      </w:r>
     </w:p>
     <w:p>
       <w:pPr>
@@ -3887,21 +3884,7 @@
         <w:rPr>
           <w:rFonts w:ascii="Times New Roman" w:hAnsi="Times New Roman" w:cs="Times New Roman"/>
         </w:rPr>
-        <w:t xml:space="preserve">Analogy to </w:t>
-      </w:r>
-      <w:proofErr w:type="spellStart"/>
-      <w:r>
-        <w:rPr>
-          <w:rFonts w:ascii="Times New Roman" w:hAnsi="Times New Roman" w:cs="Times New Roman"/>
-        </w:rPr>
-        <w:t>Lagrangian</w:t>
-      </w:r>
-      <w:proofErr w:type="spellEnd"/>
-      <w:r>
-        <w:rPr>
-          <w:rFonts w:ascii="Times New Roman" w:hAnsi="Times New Roman" w:cs="Times New Roman"/>
-        </w:rPr>
-        <w:t xml:space="preserve"> particle PDF methods in turbulence</w:t>
+        <w:t>Analogy to Lagrangian particle PDF methods in turbulence</w:t>
       </w:r>
     </w:p>
     <w:p>
@@ -4051,19 +4034,11 @@
           <w:rFonts w:ascii="Times New Roman" w:hAnsi="Times New Roman" w:cs="Times New Roman"/>
         </w:rPr>
       </w:pPr>
-      <w:proofErr w:type="gramStart"/>
-      <w:r>
-        <w:rPr>
-          <w:rFonts w:ascii="Times New Roman" w:hAnsi="Times New Roman" w:cs="Times New Roman"/>
-        </w:rPr>
-        <w:t>All of</w:t>
-      </w:r>
-      <w:proofErr w:type="gramEnd"/>
-      <w:r>
-        <w:rPr>
-          <w:rFonts w:ascii="Times New Roman" w:hAnsi="Times New Roman" w:cs="Times New Roman"/>
-        </w:rPr>
-        <w:t xml:space="preserve"> the above</w:t>
+      <w:r>
+        <w:rPr>
+          <w:rFonts w:ascii="Times New Roman" w:hAnsi="Times New Roman" w:cs="Times New Roman"/>
+        </w:rPr>
+        <w:t>All of the above</w:t>
       </w:r>
     </w:p>
     <w:p>
@@ -4083,6 +4058,7 @@
           <w:b/>
           <w:bCs/>
         </w:rPr>
+        <w:lastRenderedPageBreak/>
         <w:t>Content:</w:t>
       </w:r>
     </w:p>
@@ -4157,7 +4133,6 @@
           <w:b/>
           <w:bCs/>
         </w:rPr>
-        <w:lastRenderedPageBreak/>
         <w:t>Notes:</w:t>
       </w:r>
     </w:p>

</xml_diff>